<commit_message>
mid 2026 resume update
</commit_message>
<xml_diff>
--- a/Leontyev_Alexey.docx
+++ b/Leontyev_Alexey.docx
@@ -29,6 +29,154 @@
       <w:r>
         <w:rPr/>
         <w:t>ev</w:t>
+      </w:r>
+    </w:p>
+    <w:p>
+      <w:pPr>
+        <w:pStyle w:val="Normal"/>
+        <w:rPr>
+          <w:rFonts w:ascii="Tahoma" w:hAnsi="Tahoma" w:eastAsia="Tahoma" w:cs="Tahoma"/>
+          <w:b w:val="0"/>
+          <w:bCs w:val="0"/>
+          <w:noProof w:val="0"/>
+          <w:sz w:val="20"/>
+          <w:szCs w:val="20"/>
+          <w:lang w:val="en-US"/>
+        </w:rPr>
+      </w:pPr>
+    </w:p>
+    <w:p>
+      <w:pPr>
+        <w:pStyle w:val="Normal"/>
+        <w:rPr>
+          <w:rFonts w:ascii="Tahoma" w:hAnsi="Tahoma" w:eastAsia="Tahoma" w:cs="Tahoma"/>
+          <w:b w:val="0"/>
+          <w:bCs w:val="0"/>
+          <w:noProof w:val="0"/>
+          <w:sz w:val="28"/>
+          <w:szCs w:val="28"/>
+          <w:lang w:val="en-US"/>
+        </w:rPr>
+      </w:pPr>
+      <w:r>
+        <w:rPr>
+          <w:rFonts w:ascii="Tahoma" w:hAnsi="Tahoma" w:eastAsia="Tahoma" w:cs="Tahoma"/>
+          <w:b w:val="0"/>
+          <w:bCs w:val="0"/>
+          <w:noProof w:val="0"/>
+          <w:sz w:val="28"/>
+          <w:szCs w:val="28"/>
+          <w:lang w:val="en-US"/>
+        </w:rPr>
+        <w:t xml:space="preserve">AI-powered </w:t>
+      </w:r>
+      <w:r>
+        <w:rPr>
+          <w:rFonts w:ascii="Tahoma" w:hAnsi="Tahoma" w:eastAsia="Tahoma" w:cs="Tahoma"/>
+          <w:b w:val="1"/>
+          <w:bCs w:val="1"/>
+          <w:noProof w:val="0"/>
+          <w:sz w:val="28"/>
+          <w:szCs w:val="28"/>
+          <w:lang w:val="en-US"/>
+        </w:rPr>
+        <w:t>Senior Android Engineer</w:t>
+      </w:r>
+      <w:r>
+        <w:rPr>
+          <w:rFonts w:ascii="Tahoma" w:hAnsi="Tahoma" w:eastAsia="Tahoma" w:cs="Tahoma"/>
+          <w:b w:val="1"/>
+          <w:bCs w:val="1"/>
+          <w:noProof w:val="0"/>
+          <w:sz w:val="28"/>
+          <w:szCs w:val="28"/>
+          <w:lang w:val="en-US"/>
+        </w:rPr>
+        <w:t xml:space="preserve"> / Mobile Lead </w:t>
+      </w:r>
+      <w:r>
+        <w:rPr>
+          <w:rFonts w:ascii="Tahoma" w:hAnsi="Tahoma" w:eastAsia="Tahoma" w:cs="Tahoma"/>
+          <w:b w:val="0"/>
+          <w:bCs w:val="0"/>
+          <w:noProof w:val="0"/>
+          <w:sz w:val="28"/>
+          <w:szCs w:val="28"/>
+          <w:lang w:val="en-US"/>
+        </w:rPr>
+        <w:t xml:space="preserve">with </w:t>
+      </w:r>
+      <w:r>
+        <w:rPr>
+          <w:rFonts w:ascii="Tahoma" w:hAnsi="Tahoma" w:eastAsia="Tahoma" w:cs="Tahoma"/>
+          <w:b w:val="1"/>
+          <w:bCs w:val="1"/>
+          <w:noProof w:val="0"/>
+          <w:sz w:val="28"/>
+          <w:szCs w:val="28"/>
+          <w:lang w:val="en-US"/>
+        </w:rPr>
+        <w:t>10+ years</w:t>
+      </w:r>
+      <w:r>
+        <w:rPr>
+          <w:rFonts w:ascii="Tahoma" w:hAnsi="Tahoma" w:eastAsia="Tahoma" w:cs="Tahoma"/>
+          <w:b w:val="0"/>
+          <w:bCs w:val="0"/>
+          <w:noProof w:val="0"/>
+          <w:sz w:val="28"/>
+          <w:szCs w:val="28"/>
+          <w:lang w:val="en-US"/>
+        </w:rPr>
+        <w:t xml:space="preserve"> delivering scalable mobile products (fintech, </w:t>
+      </w:r>
+      <w:r>
+        <w:rPr>
+          <w:rFonts w:ascii="Tahoma" w:hAnsi="Tahoma" w:eastAsia="Tahoma" w:cs="Tahoma"/>
+          <w:b w:val="0"/>
+          <w:bCs w:val="0"/>
+          <w:noProof w:val="0"/>
+          <w:sz w:val="28"/>
+          <w:szCs w:val="28"/>
+          <w:lang w:val="en-US"/>
+        </w:rPr>
+        <w:t xml:space="preserve">crypto, </w:t>
+      </w:r>
+      <w:r>
+        <w:rPr>
+          <w:rFonts w:ascii="Tahoma" w:hAnsi="Tahoma" w:eastAsia="Tahoma" w:cs="Tahoma"/>
+          <w:b w:val="0"/>
+          <w:bCs w:val="0"/>
+          <w:noProof w:val="0"/>
+          <w:sz w:val="28"/>
+          <w:szCs w:val="28"/>
+          <w:lang w:val="en-US"/>
+        </w:rPr>
+        <w:t xml:space="preserve">video, </w:t>
+      </w:r>
+      <w:r>
+        <w:rPr>
+          <w:rFonts w:ascii="Tahoma" w:hAnsi="Tahoma" w:eastAsia="Tahoma" w:cs="Tahoma"/>
+          <w:b w:val="1"/>
+          <w:bCs w:val="1"/>
+          <w:noProof w:val="0"/>
+          <w:sz w:val="28"/>
+          <w:szCs w:val="28"/>
+          <w:lang w:val="en-US"/>
+        </w:rPr>
+        <w:t>20M+ DAU</w:t>
+      </w:r>
+      <w:r>
+        <w:rPr>
+          <w:rFonts w:ascii="Tahoma" w:hAnsi="Tahoma" w:eastAsia="Tahoma" w:cs="Tahoma"/>
+          <w:b w:val="0"/>
+          <w:bCs w:val="0"/>
+          <w:noProof w:val="0"/>
+          <w:sz w:val="28"/>
+          <w:szCs w:val="28"/>
+          <w:lang w:val="en-US"/>
+        </w:rPr>
+        <w:t>)</w:t>
       </w:r>
     </w:p>
     <w:p>
@@ -99,7 +247,7 @@
         </w:rPr>
         <w:t>leontiev</w:t>
       </w:r>
-      <w:hyperlink r:id="R837bd0f946dc4a08">
+      <w:hyperlink r:id="R4a0020aad9884e81">
         <w:r>
           <w:rPr>
             <w:rStyle w:val="Hyperlink"/>
@@ -145,567 +293,33 @@
         </w:rPr>
       </w:pPr>
     </w:p>
-    <w:p xmlns:wp14="http://schemas.microsoft.com/office/word/2010/wordml" wp14:textId="77777777">
-      <w:pPr>
-        <w:pStyle w:val="Heading1"/>
-      </w:pPr>
-      <w:r>
-        <w:rPr>
-          <w:rStyle w:val="Heading1Char"/>
-        </w:rPr>
-        <w:t>SUMM</w:t>
-      </w:r>
-      <w:r>
-        <w:rPr/>
-        <w:t>ARY</w:t>
-      </w:r>
-    </w:p>
-    <w:p>
-      <w:pPr>
-        <w:pStyle w:val="Normal"/>
-        <w:spacing w:before="240" w:beforeAutospacing="off" w:after="240" w:afterAutospacing="off"/>
-        <w:rPr>
-          <w:rFonts w:ascii="Tahoma" w:hAnsi="Tahoma" w:eastAsia="Tahoma" w:cs="Tahoma"/>
-          <w:noProof w:val="0"/>
-          <w:sz w:val="20"/>
-          <w:szCs w:val="20"/>
-          <w:lang w:val="en-US"/>
-        </w:rPr>
-      </w:pPr>
-      <w:r>
-        <w:rPr>
-          <w:rFonts w:ascii="Tahoma" w:hAnsi="Tahoma" w:eastAsia="Tahoma" w:cs="Tahoma"/>
-          <w:b w:val="0"/>
-          <w:bCs w:val="0"/>
-          <w:noProof w:val="0"/>
-          <w:sz w:val="20"/>
-          <w:szCs w:val="20"/>
-          <w:lang w:val="en-US"/>
-        </w:rPr>
-        <w:t xml:space="preserve">AI-powered </w:t>
-      </w:r>
-      <w:r>
-        <w:rPr>
-          <w:rFonts w:ascii="Tahoma" w:hAnsi="Tahoma" w:eastAsia="Tahoma" w:cs="Tahoma"/>
-          <w:b w:val="1"/>
-          <w:bCs w:val="1"/>
-          <w:noProof w:val="0"/>
-          <w:sz w:val="20"/>
-          <w:szCs w:val="20"/>
-          <w:lang w:val="en-US"/>
-        </w:rPr>
-        <w:t>Senior Android Engineer</w:t>
-      </w:r>
-      <w:r>
-        <w:rPr>
-          <w:rFonts w:ascii="Tahoma" w:hAnsi="Tahoma" w:eastAsia="Tahoma" w:cs="Tahoma"/>
-          <w:b w:val="0"/>
-          <w:bCs w:val="0"/>
-          <w:noProof w:val="0"/>
-          <w:sz w:val="20"/>
-          <w:szCs w:val="20"/>
-          <w:lang w:val="en-US"/>
-        </w:rPr>
-        <w:t xml:space="preserve"> with </w:t>
-      </w:r>
-      <w:r>
-        <w:rPr>
-          <w:rFonts w:ascii="Tahoma" w:hAnsi="Tahoma" w:eastAsia="Tahoma" w:cs="Tahoma"/>
-          <w:b w:val="1"/>
-          <w:bCs w:val="1"/>
-          <w:noProof w:val="0"/>
-          <w:sz w:val="20"/>
-          <w:szCs w:val="20"/>
-          <w:lang w:val="en-US"/>
-        </w:rPr>
-        <w:t>10+ years</w:t>
-      </w:r>
-      <w:r>
-        <w:rPr>
-          <w:rFonts w:ascii="Tahoma" w:hAnsi="Tahoma" w:eastAsia="Tahoma" w:cs="Tahoma"/>
-          <w:b w:val="0"/>
-          <w:bCs w:val="0"/>
-          <w:noProof w:val="0"/>
-          <w:sz w:val="20"/>
-          <w:szCs w:val="20"/>
-          <w:lang w:val="en-US"/>
-        </w:rPr>
-        <w:t xml:space="preserve"> of experience delivering high-impact mobile products in fintech, </w:t>
-      </w:r>
-      <w:r>
-        <w:rPr>
-          <w:rFonts w:ascii="Tahoma" w:hAnsi="Tahoma" w:eastAsia="Tahoma" w:cs="Tahoma"/>
-          <w:b w:val="0"/>
-          <w:bCs w:val="0"/>
-          <w:noProof w:val="0"/>
-          <w:sz w:val="20"/>
-          <w:szCs w:val="20"/>
-          <w:lang w:val="en-US"/>
-        </w:rPr>
-        <w:t>video</w:t>
-      </w:r>
-      <w:r>
-        <w:rPr>
-          <w:rFonts w:ascii="Tahoma" w:hAnsi="Tahoma" w:eastAsia="Tahoma" w:cs="Tahoma"/>
-          <w:b w:val="0"/>
-          <w:bCs w:val="0"/>
-          <w:noProof w:val="0"/>
-          <w:sz w:val="20"/>
-          <w:szCs w:val="20"/>
-          <w:lang w:val="en-US"/>
-        </w:rPr>
-        <w:t>,</w:t>
-      </w:r>
-      <w:r>
-        <w:rPr>
-          <w:rFonts w:ascii="Tahoma" w:hAnsi="Tahoma" w:eastAsia="Tahoma" w:cs="Tahoma"/>
-          <w:b w:val="0"/>
-          <w:bCs w:val="0"/>
-          <w:noProof w:val="0"/>
-          <w:sz w:val="20"/>
-          <w:szCs w:val="20"/>
-          <w:lang w:val="en-US"/>
-        </w:rPr>
-        <w:t xml:space="preserve"> </w:t>
-      </w:r>
-      <w:r>
-        <w:rPr>
-          <w:rFonts w:ascii="Tahoma" w:hAnsi="Tahoma" w:eastAsia="Tahoma" w:cs="Tahoma"/>
-          <w:b w:val="0"/>
-          <w:bCs w:val="0"/>
-          <w:noProof w:val="0"/>
-          <w:sz w:val="20"/>
-          <w:szCs w:val="20"/>
-          <w:lang w:val="en-US"/>
-        </w:rPr>
-        <w:t xml:space="preserve">and productivity, </w:t>
-      </w:r>
-      <w:r>
-        <w:rPr>
-          <w:rFonts w:ascii="Tahoma" w:hAnsi="Tahoma" w:eastAsia="Tahoma" w:cs="Tahoma"/>
-          <w:b w:val="0"/>
-          <w:bCs w:val="0"/>
-          <w:noProof w:val="0"/>
-          <w:sz w:val="20"/>
-          <w:szCs w:val="20"/>
-          <w:lang w:val="en-US"/>
-        </w:rPr>
-        <w:t xml:space="preserve">including </w:t>
-      </w:r>
-      <w:r>
-        <w:rPr>
-          <w:rFonts w:ascii="Tahoma" w:hAnsi="Tahoma" w:eastAsia="Tahoma" w:cs="Tahoma"/>
-          <w:b w:val="0"/>
-          <w:bCs w:val="0"/>
-          <w:noProof w:val="0"/>
-          <w:sz w:val="20"/>
-          <w:szCs w:val="20"/>
-          <w:lang w:val="en-US"/>
-        </w:rPr>
-        <w:t>apps</w:t>
-      </w:r>
-      <w:r>
-        <w:rPr>
-          <w:rFonts w:ascii="Tahoma" w:hAnsi="Tahoma" w:eastAsia="Tahoma" w:cs="Tahoma"/>
-          <w:b w:val="0"/>
-          <w:bCs w:val="0"/>
-          <w:noProof w:val="0"/>
-          <w:sz w:val="20"/>
-          <w:szCs w:val="20"/>
-          <w:lang w:val="en-US"/>
-        </w:rPr>
-        <w:t xml:space="preserve"> </w:t>
-      </w:r>
-      <w:r>
-        <w:rPr>
-          <w:rFonts w:ascii="Tahoma" w:hAnsi="Tahoma" w:eastAsia="Tahoma" w:cs="Tahoma"/>
-          <w:b w:val="0"/>
-          <w:bCs w:val="0"/>
-          <w:noProof w:val="0"/>
-          <w:sz w:val="20"/>
-          <w:szCs w:val="20"/>
-          <w:lang w:val="en-US"/>
-        </w:rPr>
-        <w:t xml:space="preserve">with </w:t>
-      </w:r>
-      <w:r>
-        <w:rPr>
-          <w:rFonts w:ascii="Tahoma" w:hAnsi="Tahoma" w:eastAsia="Tahoma" w:cs="Tahoma"/>
-          <w:b w:val="1"/>
-          <w:bCs w:val="1"/>
-          <w:noProof w:val="0"/>
-          <w:sz w:val="20"/>
-          <w:szCs w:val="20"/>
-          <w:lang w:val="en-US"/>
-        </w:rPr>
-        <w:t>20M+ daily active users</w:t>
-      </w:r>
-      <w:r>
-        <w:rPr>
-          <w:rFonts w:ascii="Tahoma" w:hAnsi="Tahoma" w:eastAsia="Tahoma" w:cs="Tahoma"/>
-          <w:b w:val="0"/>
-          <w:bCs w:val="0"/>
-          <w:noProof w:val="0"/>
-          <w:sz w:val="20"/>
-          <w:szCs w:val="20"/>
-          <w:lang w:val="en-US"/>
-        </w:rPr>
-        <w:t>.</w:t>
-      </w:r>
-      <w:r>
-        <w:rPr>
-          <w:rFonts w:ascii="Tahoma" w:hAnsi="Tahoma" w:eastAsia="Tahoma" w:cs="Tahoma"/>
-          <w:b w:val="0"/>
-          <w:bCs w:val="0"/>
-          <w:noProof w:val="0"/>
-          <w:sz w:val="20"/>
-          <w:szCs w:val="20"/>
-          <w:lang w:val="en-US"/>
-        </w:rPr>
-        <w:t xml:space="preserve"> </w:t>
-      </w:r>
-      <w:r>
-        <w:rPr>
-          <w:rFonts w:ascii="Tahoma" w:hAnsi="Tahoma" w:eastAsia="Tahoma" w:cs="Tahoma"/>
-          <w:b w:val="0"/>
-          <w:bCs w:val="0"/>
-          <w:noProof w:val="0"/>
-          <w:sz w:val="20"/>
-          <w:szCs w:val="20"/>
-          <w:lang w:val="en-US"/>
-        </w:rPr>
-        <w:t>Expert in Kotlin, Jetpack Compose, Coroutines</w:t>
-      </w:r>
-      <w:r>
-        <w:rPr>
-          <w:rFonts w:ascii="Tahoma" w:hAnsi="Tahoma" w:eastAsia="Tahoma" w:cs="Tahoma"/>
-          <w:b w:val="0"/>
-          <w:bCs w:val="0"/>
-          <w:noProof w:val="0"/>
-          <w:sz w:val="20"/>
-          <w:szCs w:val="20"/>
-          <w:lang w:val="en-US"/>
-        </w:rPr>
-        <w:t>/Flow</w:t>
-      </w:r>
-      <w:r>
-        <w:rPr>
-          <w:rFonts w:ascii="Tahoma" w:hAnsi="Tahoma" w:eastAsia="Tahoma" w:cs="Tahoma"/>
-          <w:b w:val="0"/>
-          <w:bCs w:val="0"/>
-          <w:noProof w:val="0"/>
-          <w:sz w:val="20"/>
-          <w:szCs w:val="20"/>
-          <w:lang w:val="en-US"/>
-        </w:rPr>
-        <w:t xml:space="preserve">, and scalable Android architectures, with </w:t>
-      </w:r>
-      <w:r>
-        <w:rPr>
-          <w:rFonts w:ascii="Tahoma" w:hAnsi="Tahoma" w:eastAsia="Tahoma" w:cs="Tahoma"/>
-          <w:b w:val="0"/>
-          <w:bCs w:val="0"/>
-          <w:noProof w:val="0"/>
-          <w:sz w:val="20"/>
-          <w:szCs w:val="20"/>
-          <w:lang w:val="en-US"/>
-        </w:rPr>
-        <w:t>a track record</w:t>
-      </w:r>
-      <w:r>
-        <w:rPr>
-          <w:rFonts w:ascii="Tahoma" w:hAnsi="Tahoma" w:eastAsia="Tahoma" w:cs="Tahoma"/>
-          <w:b w:val="0"/>
-          <w:bCs w:val="0"/>
-          <w:noProof w:val="0"/>
-          <w:sz w:val="20"/>
-          <w:szCs w:val="20"/>
-          <w:lang w:val="en-US"/>
-        </w:rPr>
-        <w:t xml:space="preserve"> of </w:t>
-      </w:r>
-      <w:r>
-        <w:rPr>
-          <w:rFonts w:ascii="Tahoma" w:hAnsi="Tahoma" w:eastAsia="Tahoma" w:cs="Tahoma"/>
-          <w:b w:val="0"/>
-          <w:bCs w:val="0"/>
-          <w:noProof w:val="0"/>
-          <w:sz w:val="20"/>
-          <w:szCs w:val="20"/>
-          <w:lang w:val="en-US"/>
-        </w:rPr>
-        <w:t>improving engagement and business metrics, leading teams, and shipping complex features end-to-end</w:t>
-      </w:r>
-      <w:r>
-        <w:rPr>
-          <w:rFonts w:ascii="Tahoma" w:hAnsi="Tahoma" w:eastAsia="Tahoma" w:cs="Tahoma"/>
-          <w:b w:val="0"/>
-          <w:bCs w:val="0"/>
-          <w:noProof w:val="0"/>
-          <w:sz w:val="20"/>
-          <w:szCs w:val="20"/>
-          <w:lang w:val="en-US"/>
-        </w:rPr>
-        <w:t xml:space="preserve">. </w:t>
-      </w:r>
-      <w:r>
-        <w:rPr>
-          <w:rFonts w:ascii="Tahoma" w:hAnsi="Tahoma" w:eastAsia="Tahoma" w:cs="Tahoma"/>
-          <w:b w:val="0"/>
-          <w:bCs w:val="0"/>
-          <w:noProof w:val="0"/>
-          <w:sz w:val="20"/>
-          <w:szCs w:val="20"/>
-          <w:lang w:val="en-US"/>
-        </w:rPr>
-        <w:t xml:space="preserve">Actively </w:t>
-      </w:r>
-      <w:r>
-        <w:rPr>
-          <w:rFonts w:ascii="Tahoma" w:hAnsi="Tahoma" w:eastAsia="Tahoma" w:cs="Tahoma"/>
-          <w:b w:val="0"/>
-          <w:bCs w:val="0"/>
-          <w:noProof w:val="0"/>
-          <w:sz w:val="20"/>
-          <w:szCs w:val="20"/>
-          <w:lang w:val="en-US"/>
-        </w:rPr>
-        <w:t>leverages</w:t>
-      </w:r>
-      <w:r>
-        <w:rPr>
-          <w:rFonts w:ascii="Tahoma" w:hAnsi="Tahoma" w:eastAsia="Tahoma" w:cs="Tahoma"/>
-          <w:b w:val="0"/>
-          <w:bCs w:val="0"/>
-          <w:noProof w:val="0"/>
-          <w:sz w:val="20"/>
-          <w:szCs w:val="20"/>
-          <w:lang w:val="en-US"/>
-        </w:rPr>
-        <w:t xml:space="preserve"> AI tools (Cursor, Claude Code, multi-agent workflows) to speed up implementation while keeping code quality and reliability high.</w:t>
-      </w:r>
-    </w:p>
-    <w:p>
-      <w:pPr>
-        <w:pStyle w:val="Normal"/>
-        <w:spacing w:before="240" w:beforeAutospacing="off" w:after="240" w:afterAutospacing="off"/>
-        <w:rPr>
-          <w:rFonts w:ascii="Tahoma" w:hAnsi="Tahoma" w:eastAsia="Tahoma" w:cs="Tahoma"/>
-          <w:b w:val="0"/>
-          <w:bCs w:val="0"/>
-          <w:noProof w:val="0"/>
-          <w:sz w:val="20"/>
-          <w:szCs w:val="20"/>
-          <w:lang w:val="en-US"/>
-        </w:rPr>
-      </w:pPr>
-    </w:p>
-    <w:p>
-      <w:pPr>
-        <w:pStyle w:val="Heading1"/>
-        <w:rPr>
-          <w:noProof w:val="0"/>
-          <w:lang w:val="en-US"/>
-        </w:rPr>
-      </w:pPr>
-      <w:r>
-        <w:rPr>
-          <w:noProof w:val="0"/>
-          <w:lang w:val="en-US"/>
-        </w:rPr>
-        <w:t>SKILLS</w:t>
-      </w:r>
-    </w:p>
-    <w:p>
-      <w:pPr>
-        <w:pStyle w:val="Normal"/>
-      </w:pPr>
-      <w:r>
-        <w:rPr>
-          <w:b w:val="1"/>
-          <w:bCs w:val="1"/>
-          <w:i w:val="0"/>
-          <w:iCs w:val="0"/>
-        </w:rPr>
-        <w:t>Programming</w:t>
-      </w:r>
-      <w:r>
-        <w:rPr/>
-        <w:t xml:space="preserve">: Kotlin (Expert), Java (Expert), Swift (Intermediate), C++ (Intermediate), Android SDK, Jetpack Compose, Coroutines/Flow, Room, Hilt/Dagger, Retrofit, Gradle </w:t>
-      </w:r>
-    </w:p>
-    <w:p>
-      <w:pPr>
-        <w:pStyle w:val="Normal"/>
-      </w:pPr>
-      <w:r>
-        <w:rPr>
-          <w:b w:val="1"/>
-          <w:bCs w:val="1"/>
-        </w:rPr>
-        <w:t>Architecture</w:t>
-      </w:r>
-      <w:r>
-        <w:rPr/>
-        <w:t xml:space="preserve">: Clean Architecture, SOLID, System design, TDD, MVVM/MVI/MVP, multi-module projects </w:t>
-      </w:r>
-    </w:p>
-    <w:p>
-      <w:pPr>
-        <w:pStyle w:val="Normal"/>
-      </w:pPr>
-      <w:r>
-        <w:rPr>
-          <w:b w:val="1"/>
-          <w:bCs w:val="1"/>
-        </w:rPr>
-        <w:t>Testing &amp; Automation</w:t>
-      </w:r>
-      <w:r>
-        <w:rPr/>
-        <w:t xml:space="preserve">: Unit &amp; </w:t>
-      </w:r>
-      <w:r>
-        <w:rPr/>
-        <w:t xml:space="preserve">UI </w:t>
-      </w:r>
-      <w:r>
-        <w:rPr/>
-        <w:t>testing</w:t>
-      </w:r>
-      <w:r>
-        <w:rPr/>
-        <w:t xml:space="preserve"> </w:t>
-      </w:r>
-      <w:r>
-        <w:rPr/>
-        <w:t>(</w:t>
-      </w:r>
-      <w:r>
-        <w:rPr/>
-        <w:t>JUnit,</w:t>
-      </w:r>
-      <w:r>
-        <w:rPr/>
-        <w:t xml:space="preserve"> Mockito, Espresso, </w:t>
-      </w:r>
-      <w:r>
-        <w:rPr/>
-        <w:t>Kaspresso</w:t>
-      </w:r>
-      <w:r>
-        <w:rPr/>
-        <w:t>)</w:t>
-      </w:r>
-      <w:r>
-        <w:rPr/>
-        <w:t>, CI/CD (Jenkins, TeamCity), performance &amp; memory profiling</w:t>
-      </w:r>
-    </w:p>
-    <w:p>
-      <w:pPr>
-        <w:pStyle w:val="Normal"/>
-      </w:pPr>
-      <w:r>
-        <w:rPr>
-          <w:b w:val="1"/>
-          <w:bCs w:val="1"/>
-        </w:rPr>
-        <w:t>AI</w:t>
-      </w:r>
-      <w:r>
-        <w:rPr/>
-        <w:t xml:space="preserve">: Cursor, Claude Code, Gemini, multi-agent workflows, cost optimization, </w:t>
-      </w:r>
-      <w:r>
-        <w:rPr/>
-        <w:t xml:space="preserve">rules, </w:t>
-      </w:r>
-      <w:r>
-        <w:rPr/>
-        <w:t>MCP</w:t>
-      </w:r>
-    </w:p>
-    <w:p>
-      <w:pPr>
-        <w:pStyle w:val="Normal"/>
-      </w:pPr>
-      <w:r>
-        <w:rPr>
-          <w:b w:val="1"/>
-          <w:bCs w:val="1"/>
-        </w:rPr>
-        <w:t>Publishing &amp; Analytics</w:t>
-      </w:r>
-      <w:r>
-        <w:rPr/>
-        <w:t>: Play Store publishing (from scratch), release pipeline, A/B experiments, product metrics, crash-free rate, ANR monitoring</w:t>
-      </w:r>
-    </w:p>
-    <w:p>
-      <w:pPr>
-        <w:pStyle w:val="Normal"/>
-      </w:pPr>
-      <w:r>
-        <w:rPr>
-          <w:b w:val="1"/>
-          <w:bCs w:val="1"/>
-        </w:rPr>
-        <w:t>Leadership</w:t>
-      </w:r>
-      <w:r>
-        <w:rPr/>
-        <w:t xml:space="preserve">: </w:t>
-      </w:r>
-      <w:r>
-        <w:rPr/>
-        <w:t>T</w:t>
-      </w:r>
-      <w:r>
-        <w:rPr/>
-        <w:t>eam leadership, mentoring, product ownership, hiring, conflict resolution, public speaking</w:t>
-      </w:r>
-    </w:p>
-    <w:p>
-      <w:pPr>
-        <w:pStyle w:val="Normal"/>
-      </w:pPr>
-      <w:r>
-        <w:rPr>
-          <w:b w:val="1"/>
-          <w:bCs w:val="1"/>
-        </w:rPr>
-        <w:t>Languages</w:t>
-      </w:r>
-      <w:r>
-        <w:rPr/>
-        <w:t>: English (C1), Russian (Native)</w:t>
-      </w:r>
-    </w:p>
-    <w:p>
-      <w:pPr>
-        <w:pStyle w:val="Normal"/>
-      </w:pPr>
-    </w:p>
     <w:p>
       <w:pPr>
         <w:pStyle w:val="Heading1"/>
         <w:bidi w:val="0"/>
         <w:spacing w:before="0" w:beforeAutospacing="off" w:after="0" w:afterAutospacing="off"/>
         <w:ind/>
-      </w:pPr>
-      <w:r>
-        <w:rPr/>
+        <w:rPr>
+          <w:rFonts w:ascii="Tahoma" w:hAnsi="Tahoma" w:eastAsia="Tahoma" w:cs="Tahoma"/>
+        </w:rPr>
+      </w:pPr>
+      <w:r>
+        <w:rPr>
+          <w:rFonts w:ascii="Tahoma" w:hAnsi="Tahoma" w:eastAsia="Tahoma" w:cs="Tahoma"/>
+        </w:rPr>
         <w:t xml:space="preserve">WORK </w:t>
       </w:r>
       <w:r>
-        <w:rPr/>
+        <w:rPr>
+          <w:rFonts w:ascii="Tahoma" w:hAnsi="Tahoma" w:eastAsia="Tahoma" w:cs="Tahoma"/>
+        </w:rPr>
         <w:t>EXPERIENCE</w:t>
       </w:r>
     </w:p>
     <w:p>
       <w:pPr>
         <w:pStyle w:val="Normal"/>
+        <w:bidi w:val="0"/>
       </w:pPr>
     </w:p>
     <w:p>
@@ -724,63 +338,35 @@
           <w:b w:val="1"/>
           <w:bCs w:val="1"/>
         </w:rPr>
-        <w:t>Revolut (</w:t>
-      </w:r>
-      <w:r>
-        <w:rPr>
-          <w:b w:val="1"/>
-          <w:bCs w:val="1"/>
-        </w:rPr>
-        <w:t>f</w:t>
-      </w:r>
-      <w:r>
-        <w:rPr>
-          <w:b w:val="1"/>
-          <w:bCs w:val="1"/>
-        </w:rPr>
-        <w:t xml:space="preserve">intech) </w:t>
-      </w:r>
-      <w:r>
-        <w:rPr>
-          <w:b w:val="1"/>
-          <w:bCs w:val="1"/>
-        </w:rPr>
-        <w:t xml:space="preserve">· </w:t>
-      </w:r>
-      <w:r>
-        <w:rPr>
-          <w:b w:val="1"/>
-          <w:bCs w:val="1"/>
-        </w:rPr>
-        <w:t>0</w:t>
-      </w:r>
-      <w:r>
-        <w:rPr>
-          <w:b w:val="1"/>
-          <w:bCs w:val="1"/>
-        </w:rPr>
-        <w:t>5</w:t>
-      </w:r>
-      <w:r>
-        <w:rPr>
-          <w:b w:val="1"/>
-          <w:bCs w:val="1"/>
-        </w:rPr>
-        <w:t>.202</w:t>
-      </w:r>
-      <w:r>
-        <w:rPr>
-          <w:b w:val="1"/>
-          <w:bCs w:val="1"/>
-        </w:rPr>
-        <w:t>5</w:t>
-      </w:r>
-      <w:r>
-        <w:rPr>
-          <w:b w:val="1"/>
-          <w:bCs w:val="1"/>
-        </w:rPr>
-        <w:t xml:space="preserve"> – Present</w:t>
+        <w:t xml:space="preserve">Stealth startup </w:t>
+      </w:r>
+      <w:r>
+        <w:rPr>
+          <w:b w:val="1"/>
+          <w:bCs w:val="1"/>
+        </w:rPr>
+        <w:t>(fintech/crypto) · 0</w:t>
+      </w:r>
+      <w:r>
+        <w:rPr>
+          <w:b w:val="1"/>
+          <w:bCs w:val="1"/>
+        </w:rPr>
+        <w:t>6</w:t>
+      </w:r>
+      <w:r>
+        <w:rPr>
+          <w:b w:val="1"/>
+          <w:bCs w:val="1"/>
+        </w:rPr>
+        <w:t xml:space="preserve">.2026 – </w:t>
+      </w:r>
+      <w:r>
+        <w:rPr>
+          <w:b w:val="1"/>
+          <w:bCs w:val="1"/>
+        </w:rPr>
+        <w:t>07.2026</w:t>
       </w:r>
       <w:r>
         <w:rPr>
@@ -794,21 +380,21 @@
           <w:b w:val="1"/>
           <w:bCs w:val="1"/>
         </w:rPr>
-        <w:t>·</w:t>
-      </w:r>
-      <w:r>
-        <w:rPr>
-          <w:b w:val="1"/>
-          <w:bCs w:val="1"/>
-        </w:rPr>
-        <w:t xml:space="preserve"> Android Engineer · </w:t>
-      </w:r>
-      <w:r>
-        <w:rPr>
-          <w:b w:val="1"/>
-          <w:bCs w:val="1"/>
-        </w:rPr>
-        <w:t>Portugal (remote)</w:t>
+        <w:t>· Mobile Lead</w:t>
+      </w:r>
+      <w:r>
+        <w:rPr>
+          <w:b w:val="1"/>
+          <w:bCs w:val="1"/>
+        </w:rPr>
+        <w:t xml:space="preserve"> </w:t>
+      </w:r>
+      <w:r>
+        <w:rPr>
+          <w:b w:val="1"/>
+          <w:bCs w:val="1"/>
+        </w:rPr>
+        <w:t>· Portugal (remote)</w:t>
       </w:r>
     </w:p>
     <w:p>
@@ -818,125 +404,140 @@
       </w:pPr>
       <w:r>
         <w:rPr/>
-        <w:t xml:space="preserve">Building a </w:t>
-      </w:r>
-      <w:r>
-        <w:rPr/>
-        <w:t xml:space="preserve">new </w:t>
-      </w:r>
-      <w:r>
-        <w:rPr/>
-        <w:t>scalable business banking Android product from scratch (Kotlin, Coroutines, Flow).</w:t>
+        <w:t xml:space="preserve">Led the mobile team </w:t>
+      </w:r>
+      <w:r>
+        <w:rPr/>
+        <w:t xml:space="preserve">and </w:t>
+      </w:r>
+      <w:r>
+        <w:rPr/>
+        <w:t xml:space="preserve">building </w:t>
+      </w:r>
+      <w:r>
+        <w:rPr/>
+        <w:t xml:space="preserve">from scratch to beta in 1 month </w:t>
+      </w:r>
+      <w:r>
+        <w:rPr/>
+        <w:t xml:space="preserve">a </w:t>
+      </w:r>
+      <w:r>
+        <w:rPr/>
+        <w:t>KMP</w:t>
+      </w:r>
+      <w:r>
+        <w:rPr/>
+        <w:t xml:space="preserve"> app for Android and iOS</w:t>
+      </w:r>
+      <w:r>
+        <w:rPr/>
+        <w:t>.</w:t>
       </w:r>
     </w:p>
     <w:p>
       <w:pPr>
         <w:pStyle w:val="Bullet2"/>
-        <w:rPr/>
-      </w:pPr>
-      <w:r>
-        <w:rPr/>
-        <w:t>Working in a small, fast-paced cross-functional team, owning features from discovery to release.</w:t>
+        <w:rPr>
+          <w:noProof w:val="0"/>
+          <w:lang w:val="en-US"/>
+        </w:rPr>
+      </w:pPr>
+      <w:r>
+        <w:rPr>
+          <w:noProof w:val="0"/>
+          <w:lang w:val="en-US"/>
+        </w:rPr>
+        <w:t>Designed mobile architecture and core infrastructure (auth, navigation, security,</w:t>
+      </w:r>
+      <w:r>
+        <w:rPr>
+          <w:noProof w:val="0"/>
+          <w:lang w:val="en-US"/>
+        </w:rPr>
+        <w:t xml:space="preserve"> etc.</w:t>
+      </w:r>
+      <w:r>
+        <w:rPr>
+          <w:noProof w:val="0"/>
+          <w:lang w:val="en-US"/>
+        </w:rPr>
+        <w:t>)</w:t>
+      </w:r>
+      <w:r>
+        <w:rPr>
+          <w:noProof w:val="0"/>
+          <w:lang w:val="en-US"/>
+        </w:rPr>
+        <w:t>.</w:t>
       </w:r>
     </w:p>
     <w:p>
       <w:pPr>
         <w:pStyle w:val="Bullet2"/>
-        <w:rPr/>
-      </w:pPr>
-      <w:r>
-        <w:rPr/>
-        <w:t xml:space="preserve">Actively </w:t>
-      </w:r>
-      <w:r>
-        <w:rPr/>
-        <w:t>leveraging</w:t>
-      </w:r>
-      <w:r>
-        <w:rPr/>
-        <w:t xml:space="preserve"> AI tools to speed up </w:t>
-      </w:r>
-      <w:r>
-        <w:rPr/>
-        <w:t>delivery</w:t>
-      </w:r>
-      <w:r>
-        <w:rPr/>
-        <w:t xml:space="preserve"> </w:t>
-      </w:r>
-      <w:r>
-        <w:rPr/>
-        <w:t xml:space="preserve">while </w:t>
-      </w:r>
-      <w:r>
-        <w:rPr/>
-        <w:t>maint</w:t>
-      </w:r>
-      <w:r>
-        <w:rPr/>
-        <w:t>aining</w:t>
-      </w:r>
-      <w:r>
-        <w:rPr/>
-        <w:t xml:space="preserve"> high coverage and stability</w:t>
-      </w:r>
-      <w:r>
-        <w:rPr/>
-        <w:t>.</w:t>
-      </w:r>
-      <w:r>
-        <w:br/>
+        <w:rPr>
+          <w:b w:val="0"/>
+          <w:bCs w:val="0"/>
+          <w:i w:val="0"/>
+          <w:iCs w:val="0"/>
+          <w:caps w:val="0"/>
+          <w:smallCaps w:val="0"/>
+          <w:noProof w:val="0"/>
+          <w:color w:val="3F3B35"/>
+          <w:sz w:val="21"/>
+          <w:szCs w:val="21"/>
+          <w:lang w:val="en-US"/>
+        </w:rPr>
+      </w:pPr>
+      <w:r>
+        <w:rPr>
+          <w:b w:val="0"/>
+          <w:bCs w:val="0"/>
+          <w:i w:val="0"/>
+          <w:iCs w:val="0"/>
+          <w:caps w:val="0"/>
+          <w:smallCaps w:val="0"/>
+          <w:noProof w:val="0"/>
+          <w:color w:val="3F3B35"/>
+          <w:sz w:val="21"/>
+          <w:szCs w:val="21"/>
+          <w:lang w:val="en-US"/>
+        </w:rPr>
+        <w:t>Set up the CI/CD/LLM pipeline from zero (PR checks, automated tests, nightly builds, skills, agents).</w:t>
       </w:r>
     </w:p>
     <w:p>
       <w:pPr>
-        <w:pStyle w:val="Normal"/>
-        <w:spacing w:before="0" w:beforeAutospacing="off" w:after="200" w:afterAutospacing="off" w:line="276" w:lineRule="auto"/>
-        <w:ind w:left="0" w:right="0"/>
-        <w:jc w:val="left"/>
-        <w:rPr>
-          <w:b w:val="1"/>
-          <w:bCs w:val="1"/>
-        </w:rPr>
-      </w:pPr>
-      <w:r>
-        <w:rPr>
-          <w:b w:val="1"/>
-          <w:bCs w:val="1"/>
-        </w:rPr>
-        <w:t xml:space="preserve">Avalanche (marketplace) · 07.2024 – 02.2025 · </w:t>
-      </w:r>
-      <w:r>
-        <w:rPr>
-          <w:b w:val="1"/>
-          <w:bCs w:val="1"/>
-        </w:rPr>
-        <w:t xml:space="preserve">Senior </w:t>
-      </w:r>
-      <w:r>
-        <w:rPr>
-          <w:b w:val="1"/>
-          <w:bCs w:val="1"/>
-        </w:rPr>
-        <w:t>Android Engineer · Portugal</w:t>
-      </w:r>
-    </w:p>
-    <w:p>
-      <w:pPr>
         <w:pStyle w:val="Bullet2"/>
-        <w:rPr/>
-      </w:pPr>
-      <w:r>
-        <w:rPr/>
-        <w:t xml:space="preserve">Worked on a React Native-based marketplace </w:t>
-      </w:r>
-      <w:r>
-        <w:rPr/>
-        <w:t>assistance</w:t>
-      </w:r>
-      <w:r>
-        <w:rPr/>
-        <w:t xml:space="preserve"> app, ensuring robust integration and data flow between native Android and JS code. </w:t>
+        <w:rPr>
+          <w:b w:val="0"/>
+          <w:bCs w:val="0"/>
+          <w:i w:val="0"/>
+          <w:iCs w:val="0"/>
+          <w:caps w:val="0"/>
+          <w:smallCaps w:val="0"/>
+          <w:noProof w:val="0"/>
+          <w:color w:val="3F3B35"/>
+          <w:sz w:val="21"/>
+          <w:szCs w:val="21"/>
+          <w:lang w:val="en-US"/>
+        </w:rPr>
+      </w:pPr>
+      <w:r>
+        <w:rPr>
+          <w:b w:val="0"/>
+          <w:bCs w:val="0"/>
+          <w:i w:val="0"/>
+          <w:iCs w:val="0"/>
+          <w:caps w:val="0"/>
+          <w:smallCaps w:val="0"/>
+          <w:noProof w:val="0"/>
+          <w:color w:val="3F3B35"/>
+          <w:sz w:val="21"/>
+          <w:szCs w:val="21"/>
+          <w:lang w:val="en-US"/>
+        </w:rPr>
+        <w:t>Tuned animations and performance in Compose and adapted KMP modules for iOS</w:t>
       </w:r>
     </w:p>
     <w:p>
@@ -947,16 +548,19 @@
           <w:numId w:val="0"/>
         </w:numPr>
         <w:ind w:left="0"/>
-      </w:pPr>
-    </w:p>
-    <w:p>
-      <w:pPr>
-        <w:pStyle w:val="Bullet2"/>
-        <w:numPr>
-          <w:ilvl w:val="0"/>
-          <w:numId w:val="0"/>
-        </w:numPr>
-        <w:ind w:left="0"/>
+        <w:rPr>
+          <w:b w:val="0"/>
+          <w:bCs w:val="0"/>
+          <w:i w:val="0"/>
+          <w:iCs w:val="0"/>
+          <w:caps w:val="0"/>
+          <w:smallCaps w:val="0"/>
+          <w:noProof w:val="0"/>
+          <w:color w:val="3F3B35"/>
+          <w:sz w:val="21"/>
+          <w:szCs w:val="21"/>
+          <w:lang w:val="en-US"/>
+        </w:rPr>
       </w:pPr>
     </w:p>
     <w:p>
@@ -968,6 +572,215 @@
         <w:rPr>
           <w:b w:val="1"/>
           <w:bCs w:val="1"/>
+        </w:rPr>
+      </w:pPr>
+      <w:r>
+        <w:rPr>
+          <w:b w:val="1"/>
+          <w:bCs w:val="1"/>
+        </w:rPr>
+        <w:t>Revolut (</w:t>
+      </w:r>
+      <w:r>
+        <w:rPr>
+          <w:b w:val="1"/>
+          <w:bCs w:val="1"/>
+        </w:rPr>
+        <w:t>f</w:t>
+      </w:r>
+      <w:r>
+        <w:rPr>
+          <w:b w:val="1"/>
+          <w:bCs w:val="1"/>
+        </w:rPr>
+        <w:t xml:space="preserve">intech) </w:t>
+      </w:r>
+      <w:r>
+        <w:rPr>
+          <w:b w:val="1"/>
+          <w:bCs w:val="1"/>
+        </w:rPr>
+        <w:t xml:space="preserve">· </w:t>
+      </w:r>
+      <w:r>
+        <w:rPr>
+          <w:b w:val="1"/>
+          <w:bCs w:val="1"/>
+        </w:rPr>
+        <w:t>0</w:t>
+      </w:r>
+      <w:r>
+        <w:rPr>
+          <w:b w:val="1"/>
+          <w:bCs w:val="1"/>
+        </w:rPr>
+        <w:t>5</w:t>
+      </w:r>
+      <w:r>
+        <w:rPr>
+          <w:b w:val="1"/>
+          <w:bCs w:val="1"/>
+        </w:rPr>
+        <w:t>.202</w:t>
+      </w:r>
+      <w:r>
+        <w:rPr>
+          <w:b w:val="1"/>
+          <w:bCs w:val="1"/>
+        </w:rPr>
+        <w:t>5</w:t>
+      </w:r>
+      <w:r>
+        <w:rPr>
+          <w:b w:val="1"/>
+          <w:bCs w:val="1"/>
+        </w:rPr>
+        <w:t xml:space="preserve"> – </w:t>
+      </w:r>
+      <w:r>
+        <w:rPr>
+          <w:b w:val="1"/>
+          <w:bCs w:val="1"/>
+        </w:rPr>
+        <w:t>0</w:t>
+      </w:r>
+      <w:r>
+        <w:rPr>
+          <w:b w:val="1"/>
+          <w:bCs w:val="1"/>
+        </w:rPr>
+        <w:t>6</w:t>
+      </w:r>
+      <w:r>
+        <w:rPr>
+          <w:b w:val="1"/>
+          <w:bCs w:val="1"/>
+        </w:rPr>
+        <w:t xml:space="preserve">.2026 </w:t>
+      </w:r>
+      <w:r>
+        <w:rPr>
+          <w:b w:val="1"/>
+          <w:bCs w:val="1"/>
+        </w:rPr>
+        <w:t>·</w:t>
+      </w:r>
+      <w:r>
+        <w:rPr>
+          <w:b w:val="1"/>
+          <w:bCs w:val="1"/>
+        </w:rPr>
+        <w:t xml:space="preserve"> </w:t>
+      </w:r>
+      <w:r>
+        <w:rPr>
+          <w:b w:val="1"/>
+          <w:bCs w:val="1"/>
+        </w:rPr>
+        <w:t xml:space="preserve">Android Engineer · </w:t>
+      </w:r>
+      <w:r>
+        <w:rPr>
+          <w:b w:val="1"/>
+          <w:bCs w:val="1"/>
+        </w:rPr>
+        <w:t>Portugal (remote</w:t>
+      </w:r>
+      <w:r>
+        <w:rPr>
+          <w:b w:val="1"/>
+          <w:bCs w:val="1"/>
+        </w:rPr>
+        <w:t>)</w:t>
+      </w:r>
+    </w:p>
+    <w:p>
+      <w:pPr>
+        <w:pStyle w:val="Bullet2"/>
+        <w:rPr/>
+      </w:pPr>
+      <w:r>
+        <w:rPr/>
+        <w:t xml:space="preserve">Building a </w:t>
+      </w:r>
+      <w:r>
+        <w:rPr/>
+        <w:t xml:space="preserve">new </w:t>
+      </w:r>
+      <w:r>
+        <w:rPr/>
+        <w:t>scalable business banking product from scratch (Kotlin, Coroutines, Flow).</w:t>
+      </w:r>
+    </w:p>
+    <w:p>
+      <w:pPr>
+        <w:pStyle w:val="Bullet2"/>
+        <w:rPr/>
+      </w:pPr>
+      <w:r>
+        <w:rPr/>
+        <w:t>Working in a small, fast-paced cross-functional team, owning features from discovery to release.</w:t>
+      </w:r>
+    </w:p>
+    <w:p>
+      <w:pPr>
+        <w:pStyle w:val="Bullet2"/>
+        <w:ind/>
+        <w:rPr/>
+      </w:pPr>
+      <w:r>
+        <w:rPr/>
+        <w:t xml:space="preserve">Actively </w:t>
+      </w:r>
+      <w:r>
+        <w:rPr/>
+        <w:t>leveraging</w:t>
+      </w:r>
+      <w:r>
+        <w:rPr/>
+        <w:t xml:space="preserve"> AI tools to speed up </w:t>
+      </w:r>
+      <w:r>
+        <w:rPr/>
+        <w:t>delivery</w:t>
+      </w:r>
+      <w:r>
+        <w:rPr/>
+        <w:t xml:space="preserve"> </w:t>
+      </w:r>
+      <w:r>
+        <w:rPr/>
+        <w:t xml:space="preserve">while </w:t>
+      </w:r>
+      <w:r>
+        <w:rPr/>
+        <w:t>maint</w:t>
+      </w:r>
+      <w:r>
+        <w:rPr/>
+        <w:t>aining</w:t>
+      </w:r>
+      <w:r>
+        <w:rPr/>
+        <w:t xml:space="preserve"> high coverage and stability</w:t>
+      </w:r>
+      <w:r>
+        <w:rPr/>
+        <w:t>.</w:t>
+      </w:r>
+      <w:r>
+        <w:br/>
+      </w:r>
+    </w:p>
+    <w:p>
+      <w:pPr>
+        <w:pStyle w:val="Normal"/>
+        <w:spacing w:before="0" w:beforeAutospacing="off" w:after="200" w:afterAutospacing="off" w:line="276" w:lineRule="auto"/>
+        <w:ind w:left="0" w:right="0"/>
+        <w:jc w:val="left"/>
+        <w:rPr>
+          <w:b w:val="1"/>
+          <w:bCs w:val="1"/>
           <w:noProof w:val="0"/>
           <w:lang w:val="en-US"/>
         </w:rPr>
@@ -991,21 +804,63 @@
           <w:b w:val="1"/>
           <w:bCs w:val="1"/>
         </w:rPr>
-        <w:t>productivity) · 06.2023 – 0</w:t>
-      </w:r>
-      <w:r>
-        <w:rPr>
-          <w:b w:val="1"/>
-          <w:bCs w:val="1"/>
-        </w:rPr>
-        <w:t>7</w:t>
-      </w:r>
-      <w:r>
-        <w:rPr>
-          <w:b w:val="1"/>
-          <w:bCs w:val="1"/>
-        </w:rPr>
-        <w:t xml:space="preserve">.2024 · </w:t>
+        <w:t>productivit</w:t>
+      </w:r>
+      <w:r>
+        <w:rPr>
+          <w:b w:val="1"/>
+          <w:bCs w:val="1"/>
+        </w:rPr>
+        <w:t>y</w:t>
+      </w:r>
+      <w:r>
+        <w:rPr>
+          <w:b w:val="1"/>
+          <w:bCs w:val="1"/>
+        </w:rPr>
+        <w:t>/AI</w:t>
+      </w:r>
+      <w:r>
+        <w:rPr>
+          <w:b w:val="1"/>
+          <w:bCs w:val="1"/>
+        </w:rPr>
+        <w:t>) · 06.</w:t>
+      </w:r>
+      <w:r>
+        <w:rPr>
+          <w:b w:val="1"/>
+          <w:bCs w:val="1"/>
+        </w:rPr>
+        <w:t>2023 – 0</w:t>
+      </w:r>
+      <w:r>
+        <w:rPr>
+          <w:b w:val="1"/>
+          <w:bCs w:val="1"/>
+        </w:rPr>
+        <w:t>4</w:t>
+      </w:r>
+      <w:r>
+        <w:rPr>
+          <w:b w:val="1"/>
+          <w:bCs w:val="1"/>
+        </w:rPr>
+        <w:t>.202</w:t>
+      </w:r>
+      <w:r>
+        <w:rPr>
+          <w:b w:val="1"/>
+          <w:bCs w:val="1"/>
+        </w:rPr>
+        <w:t>5</w:t>
+      </w:r>
+      <w:r>
+        <w:rPr>
+          <w:b w:val="1"/>
+          <w:bCs w:val="1"/>
+        </w:rPr>
+        <w:t xml:space="preserve"> · </w:t>
       </w:r>
       <w:r>
         <w:rPr>
@@ -1052,22 +907,34 @@
         <w:t xml:space="preserve"> · Portugal</w:t>
       </w:r>
     </w:p>
-    <w:p xmlns:wp14="http://schemas.microsoft.com/office/word/2010/wordml" wp14:textId="1455CF90">
+    <w:p xmlns:wp14="http://schemas.microsoft.com/office/word/2010/wordml" wp14:textId="613D27DD">
       <w:pPr>
         <w:pStyle w:val="Bullet2"/>
         <w:rPr/>
       </w:pPr>
       <w:r>
         <w:rPr/>
-        <w:t xml:space="preserve">Bootstrapped a B2C </w:t>
-      </w:r>
-      <w:r>
-        <w:rPr/>
-        <w:t>product</w:t>
-      </w:r>
-      <w:r>
-        <w:rPr/>
-        <w:t xml:space="preserve"> (AI-powered task management app)</w:t>
+        <w:t>Bootstrapped a</w:t>
+      </w:r>
+      <w:r>
+        <w:rPr/>
+        <w:t xml:space="preserve">n </w:t>
+      </w:r>
+      <w:r>
+        <w:rPr/>
+        <w:t xml:space="preserve">AI-powered </w:t>
+      </w:r>
+      <w:r>
+        <w:rPr/>
+        <w:t>productivity</w:t>
+      </w:r>
+      <w:r>
+        <w:rPr/>
+        <w:t xml:space="preserve"> </w:t>
+      </w:r>
+      <w:r>
+        <w:rPr/>
+        <w:t>app</w:t>
       </w:r>
       <w:r>
         <w:rPr/>
@@ -1075,51 +942,37 @@
       </w:r>
       <w:r>
         <w:rPr/>
-        <w:t xml:space="preserve"> idea to live Android app on Google Play</w:t>
-      </w:r>
-      <w:r>
-        <w:rPr/>
-        <w:t>: conducted</w:t>
-      </w:r>
-      <w:r>
-        <w:rPr/>
-        <w:t xml:space="preserve"> market and competitor research, defined MVP scope, and built the app using modern Android stack. </w:t>
-      </w:r>
-    </w:p>
-    <w:p xmlns:wp14="http://schemas.microsoft.com/office/word/2010/wordml" wp14:textId="5724F29D">
+        <w:t xml:space="preserve"> idea to live app on Google Play</w:t>
+      </w:r>
+      <w:r>
+        <w:rPr/>
+        <w:t>.</w:t>
+      </w:r>
+    </w:p>
+    <w:p>
       <w:pPr>
         <w:pStyle w:val="Bullet2"/>
         <w:rPr/>
       </w:pPr>
       <w:r>
         <w:rPr/>
-        <w:t xml:space="preserve">Set up analytics and real-user testing loops to </w:t>
-      </w:r>
-      <w:r>
-        <w:rPr/>
-        <w:t>validate</w:t>
-      </w:r>
-      <w:r>
-        <w:rPr/>
-        <w:t xml:space="preserve"> product decisions and improve retention. </w:t>
-      </w:r>
-    </w:p>
-    <w:p xmlns:wp14="http://schemas.microsoft.com/office/word/2010/wordml" wp14:textId="28A89D0A">
-      <w:pPr>
-        <w:pStyle w:val="Bullet2"/>
-        <w:rPr/>
-      </w:pPr>
-      <w:r>
-        <w:rPr/>
-        <w:t xml:space="preserve">Launched advertising campaigns to </w:t>
-      </w:r>
-      <w:r>
-        <w:rPr/>
-        <w:t>acquire</w:t>
-      </w:r>
-      <w:r>
-        <w:rPr/>
-        <w:t xml:space="preserve"> early users and pitched the project to incubators.</w:t>
+        <w:t xml:space="preserve">Pitched to incubators in </w:t>
+      </w:r>
+      <w:r>
+        <w:rPr/>
+        <w:t>EU</w:t>
+      </w:r>
+      <w:r>
+        <w:rPr/>
+        <w:t xml:space="preserve"> and US, securing acceptance from 2 programs and validating </w:t>
+      </w:r>
+      <w:r>
+        <w:rPr/>
+        <w:t>market</w:t>
+      </w:r>
+      <w:r>
+        <w:rPr/>
+        <w:t xml:space="preserve"> fit.</w:t>
       </w:r>
     </w:p>
     <w:p xmlns:wp14="http://schemas.microsoft.com/office/word/2010/wordml" wp14:textId="15362B53">
@@ -1132,12 +985,57 @@
         <w:ind w:left="490"/>
       </w:pPr>
     </w:p>
-    <w:p xmlns:wp14="http://schemas.microsoft.com/office/word/2010/wordml" wp14:textId="6EAF09BE">
+    <w:p xmlns:wp14="http://schemas.microsoft.com/office/word/2010/wordml" wp14:textId="1CFA3875">
       <w:pPr>
         <w:pStyle w:val="Normal"/>
         <w:rPr>
           <w:b w:val="1"/>
           <w:bCs w:val="1"/>
+        </w:rPr>
+      </w:pPr>
+      <w:r>
+        <w:rPr>
+          <w:b w:val="1"/>
+          <w:bCs w:val="1"/>
+        </w:rPr>
+        <w:t>Yandex ·</w:t>
+      </w:r>
+      <w:r>
+        <w:rPr>
+          <w:b w:val="1"/>
+          <w:bCs w:val="1"/>
+        </w:rPr>
+        <w:t xml:space="preserve"> 04.2019</w:t>
+      </w:r>
+      <w:r>
+        <w:rPr>
+          <w:b w:val="1"/>
+          <w:bCs w:val="1"/>
+        </w:rPr>
+        <w:t xml:space="preserve"> </w:t>
+      </w:r>
+      <w:r>
+        <w:rPr>
+          <w:b w:val="1"/>
+          <w:bCs w:val="1"/>
+        </w:rPr>
+        <w:t xml:space="preserve">– 03.2023 · </w:t>
+      </w:r>
+      <w:r>
+        <w:rPr>
+          <w:b w:val="1"/>
+          <w:bCs w:val="1"/>
+        </w:rPr>
+        <w:t>Russia</w:t>
+      </w:r>
+    </w:p>
+    <w:p xmlns:wp14="http://schemas.microsoft.com/office/word/2010/wordml" wp14:textId="60220662">
+      <w:pPr>
+        <w:pStyle w:val="Normal"/>
+        <w:ind w:firstLine="490"/>
+        <w:rPr>
+          <w:b w:val="1"/>
+          <w:bCs w:val="1"/>
           <w:lang w:val="ru-RU"/>
         </w:rPr>
       </w:pPr>
@@ -1146,7 +1044,21 @@
           <w:b w:val="1"/>
           <w:bCs w:val="1"/>
         </w:rPr>
-        <w:t xml:space="preserve">Yandex (video/browser) · 11.2020 – 03.2023 · Team Leader / </w:t>
+        <w:t>Dzen</w:t>
+      </w:r>
+      <w:r>
+        <w:rPr>
+          <w:b w:val="1"/>
+          <w:bCs w:val="1"/>
+        </w:rPr>
+        <w:t xml:space="preserve"> (video/browser) · </w:t>
+      </w:r>
+      <w:r>
+        <w:rPr>
+          <w:b w:val="1"/>
+          <w:bCs w:val="1"/>
+        </w:rPr>
+        <w:t xml:space="preserve">11.2020 – 03.2023 · Team Leader / </w:t>
       </w:r>
       <w:r>
         <w:rPr>
@@ -1167,53 +1079,160 @@
           <w:b w:val="1"/>
           <w:bCs w:val="1"/>
         </w:rPr>
-        <w:t xml:space="preserve"> · Russia</w:t>
-      </w:r>
-    </w:p>
-    <w:p xmlns:wp14="http://schemas.microsoft.com/office/word/2010/wordml" wp14:textId="4D21FDFD">
+        <w:t xml:space="preserve"> </w:t>
+      </w:r>
+    </w:p>
+    <w:p xmlns:wp14="http://schemas.microsoft.com/office/word/2010/wordml" wp14:textId="4A79369A">
       <w:pPr>
         <w:pStyle w:val="Bullet2"/>
-        <w:rPr/>
-      </w:pPr>
-      <w:r>
-        <w:rPr/>
-        <w:t xml:space="preserve">Led the Android video team (8 engineers) responsible for video features in </w:t>
-      </w:r>
-      <w:r>
-        <w:rPr/>
+        <w:rPr>
+          <w:b w:val="0"/>
+          <w:bCs w:val="0"/>
+        </w:rPr>
+      </w:pPr>
+      <w:r>
+        <w:rPr>
+          <w:b w:val="0"/>
+          <w:bCs w:val="0"/>
+        </w:rPr>
+        <w:t xml:space="preserve">Increased average user time spent on video content from </w:t>
+      </w:r>
+      <w:r>
+        <w:rPr>
+          <w:b w:val="0"/>
+          <w:bCs w:val="0"/>
+        </w:rPr>
+        <w:t>~5% to ~50%</w:t>
+      </w:r>
+      <w:r>
+        <w:rPr>
+          <w:b w:val="0"/>
+          <w:bCs w:val="0"/>
+        </w:rPr>
+        <w:t>, making video the most viewed content type in the apps.</w:t>
+      </w:r>
+    </w:p>
+    <w:p xmlns:wp14="http://schemas.microsoft.com/office/word/2010/wordml" wp14:textId="018F1755">
+      <w:pPr>
+        <w:pStyle w:val="Bullet2"/>
+        <w:rPr>
+          <w:b w:val="0"/>
+          <w:bCs w:val="0"/>
+        </w:rPr>
+      </w:pPr>
+      <w:r>
+        <w:rPr>
+          <w:b w:val="0"/>
+          <w:bCs w:val="0"/>
+        </w:rPr>
+        <w:t xml:space="preserve">Led the Android video team </w:t>
+      </w:r>
+      <w:r>
+        <w:rPr>
+          <w:b w:val="0"/>
+          <w:bCs w:val="0"/>
+        </w:rPr>
+        <w:t>(8 engineers)</w:t>
+      </w:r>
+      <w:r>
+        <w:rPr>
+          <w:b w:val="0"/>
+          <w:bCs w:val="0"/>
+        </w:rPr>
+        <w:t xml:space="preserve"> responsible for video features in </w:t>
+      </w:r>
+      <w:r>
+        <w:rPr>
+          <w:b w:val="0"/>
+          <w:bCs w:val="0"/>
+        </w:rPr>
         <w:t>Yandex.Zen</w:t>
       </w:r>
       <w:r>
-        <w:rPr/>
+        <w:rPr>
+          <w:b w:val="0"/>
+          <w:bCs w:val="0"/>
+        </w:rPr>
         <w:t xml:space="preserve"> and integrations into Yandex Search and Yandex Browser with 20M+ daily active users.</w:t>
       </w:r>
     </w:p>
-    <w:p xmlns:wp14="http://schemas.microsoft.com/office/word/2010/wordml" wp14:textId="0EA49FE6">
+    <w:p xmlns:wp14="http://schemas.microsoft.com/office/word/2010/wordml" wp14:textId="29727D3B">
       <w:pPr>
         <w:pStyle w:val="Bullet2"/>
-        <w:rPr/>
-      </w:pPr>
-      <w:r>
-        <w:rPr/>
-        <w:t>Increased average user time spent on video content from ~5% to ~50%, making video the most viewed content type in the apps.</w:t>
-      </w:r>
-    </w:p>
-    <w:p xmlns:wp14="http://schemas.microsoft.com/office/word/2010/wordml" wp14:textId="3FFD36D1">
-      <w:pPr>
-        <w:pStyle w:val="Bullet2"/>
-        <w:rPr/>
-      </w:pPr>
-      <w:r>
-        <w:rPr/>
-        <w:t xml:space="preserve">Designed an efficient </w:t>
-      </w:r>
-      <w:r>
-        <w:rPr/>
-        <w:t>component</w:t>
-      </w:r>
-      <w:r>
-        <w:rPr/>
-        <w:t xml:space="preserve"> system for embedding video layouts across the app.</w:t>
+        <w:rPr>
+          <w:b w:val="0"/>
+          <w:bCs w:val="0"/>
+        </w:rPr>
+      </w:pPr>
+      <w:r>
+        <w:rPr>
+          <w:b w:val="0"/>
+          <w:bCs w:val="0"/>
+        </w:rPr>
+        <w:t>Designed a</w:t>
+      </w:r>
+      <w:r>
+        <w:rPr>
+          <w:b w:val="0"/>
+          <w:bCs w:val="0"/>
+        </w:rPr>
+        <w:t xml:space="preserve"> new</w:t>
+      </w:r>
+      <w:r>
+        <w:rPr>
+          <w:b w:val="0"/>
+          <w:bCs w:val="0"/>
+        </w:rPr>
+        <w:t xml:space="preserve"> </w:t>
+      </w:r>
+      <w:r>
+        <w:rPr>
+          <w:b w:val="0"/>
+          <w:bCs w:val="0"/>
+        </w:rPr>
+        <w:t>effici</w:t>
+      </w:r>
+      <w:r>
+        <w:rPr>
+          <w:b w:val="0"/>
+          <w:bCs w:val="0"/>
+        </w:rPr>
+        <w:t xml:space="preserve">ent </w:t>
+      </w:r>
+      <w:r>
+        <w:rPr>
+          <w:b w:val="0"/>
+          <w:bCs w:val="0"/>
+        </w:rPr>
+        <w:t>compo</w:t>
+      </w:r>
+      <w:r>
+        <w:rPr>
+          <w:b w:val="0"/>
+          <w:bCs w:val="0"/>
+        </w:rPr>
+        <w:t>nent</w:t>
+      </w:r>
+      <w:r>
+        <w:rPr>
+          <w:b w:val="0"/>
+          <w:bCs w:val="0"/>
+        </w:rPr>
+        <w:t xml:space="preserve"> system for embedding video layouts across the app</w:t>
+      </w:r>
+      <w:r>
+        <w:rPr>
+          <w:b w:val="0"/>
+          <w:bCs w:val="0"/>
+        </w:rPr>
+        <w:t>s</w:t>
+      </w:r>
+      <w:r>
+        <w:rPr>
+          <w:b w:val="0"/>
+          <w:bCs w:val="0"/>
+        </w:rPr>
+        <w:t>.</w:t>
       </w:r>
     </w:p>
     <w:p xmlns:wp14="http://schemas.microsoft.com/office/word/2010/wordml" wp14:textId="24983DF2">
@@ -1226,20 +1245,28 @@
         <w:ind w:left="490"/>
       </w:pPr>
     </w:p>
-    <w:p xmlns:wp14="http://schemas.microsoft.com/office/word/2010/wordml" wp14:textId="6AC4DF41">
+    <w:p xmlns:wp14="http://schemas.microsoft.com/office/word/2010/wordml" wp14:textId="20C87EC9">
       <w:pPr>
         <w:pStyle w:val="Normal"/>
-        <w:rPr>
-          <w:b w:val="1"/>
-          <w:bCs w:val="1"/>
-        </w:rPr>
-      </w:pPr>
-      <w:r>
-        <w:rPr>
-          <w:b w:val="1"/>
-          <w:bCs w:val="1"/>
-        </w:rPr>
-        <w:t>Yandex (video/AR) · 04.2019 – 11.2020 · Android Engineer · Russia</w:t>
+        <w:ind w:firstLine="490"/>
+        <w:rPr>
+          <w:b w:val="1"/>
+          <w:bCs w:val="1"/>
+        </w:rPr>
+      </w:pPr>
+      <w:r>
+        <w:rPr>
+          <w:b w:val="1"/>
+          <w:bCs w:val="1"/>
+        </w:rPr>
+        <w:t>Sloy</w:t>
+      </w:r>
+      <w:r>
+        <w:rPr>
+          <w:b w:val="1"/>
+          <w:bCs w:val="1"/>
+        </w:rPr>
+        <w:t>(video/AR) · 04.2019 – 11.2020 · Android Engineer</w:t>
       </w:r>
     </w:p>
     <w:p>
@@ -1326,12 +1353,55 @@
           <w:bCs w:val="1"/>
         </w:rPr>
       </w:pPr>
-      <w:r>
-        <w:rPr>
-          <w:b w:val="1"/>
-          <w:bCs w:val="1"/>
-        </w:rPr>
-        <w:t>Earlier experience</w:t>
+    </w:p>
+    <w:p>
+      <w:pPr>
+        <w:pStyle w:val="Normal"/>
+        <w:rPr>
+          <w:b w:val="1"/>
+          <w:bCs w:val="1"/>
+        </w:rPr>
+      </w:pPr>
+      <w:r>
+        <w:rPr>
+          <w:b w:val="1"/>
+          <w:bCs w:val="1"/>
+        </w:rPr>
+        <w:t xml:space="preserve">Other </w:t>
+      </w:r>
+      <w:r>
+        <w:rPr>
+          <w:b w:val="1"/>
+          <w:bCs w:val="1"/>
+        </w:rPr>
+        <w:t>experience</w:t>
+      </w:r>
+    </w:p>
+    <w:p>
+      <w:pPr>
+        <w:pStyle w:val="Bullet2"/>
+        <w:rPr>
+          <w:noProof w:val="0"/>
+          <w:lang w:val="en-US"/>
+        </w:rPr>
+      </w:pPr>
+      <w:r>
+        <w:rPr>
+          <w:noProof w:val="0"/>
+          <w:lang w:val="en-US"/>
+        </w:rPr>
+        <w:t xml:space="preserve">Android Engineer at Avalanche (2024–2025): </w:t>
+      </w:r>
+      <w:r>
+        <w:rPr/>
+        <w:t>built Android layer for a marketplace app (React Native)</w:t>
+      </w:r>
+      <w:r>
+        <w:rPr>
+          <w:noProof w:val="0"/>
+          <w:lang w:val="en-US"/>
+        </w:rPr>
+        <w:t>.</w:t>
       </w:r>
     </w:p>
     <w:p>
@@ -1386,16 +1456,199 @@
         <w:ind/>
       </w:pPr>
     </w:p>
-    <w:p xmlns:wp14="http://schemas.microsoft.com/office/word/2010/wordml" wp14:textId="77777777">
+    <w:p>
       <w:pPr>
         <w:pStyle w:val="Heading1"/>
         <w:rPr>
+          <w:rFonts w:ascii="Tahoma" w:hAnsi="Tahoma" w:eastAsia="Tahoma" w:cs="Tahoma"/>
           <w:noProof w:val="0"/>
           <w:lang w:val="en-US"/>
         </w:rPr>
       </w:pPr>
       <w:r>
         <w:rPr>
+          <w:rFonts w:ascii="Tahoma" w:hAnsi="Tahoma" w:eastAsia="Tahoma" w:cs="Tahoma"/>
+          <w:noProof w:val="0"/>
+          <w:lang w:val="en-US"/>
+        </w:rPr>
+        <w:t>SKILLS</w:t>
+      </w:r>
+    </w:p>
+    <w:p>
+      <w:pPr>
+        <w:pStyle w:val="Normal"/>
+      </w:pPr>
+      <w:r>
+        <w:rPr>
+          <w:b w:val="1"/>
+          <w:bCs w:val="1"/>
+          <w:i w:val="0"/>
+          <w:iCs w:val="0"/>
+        </w:rPr>
+        <w:t>Programming</w:t>
+      </w:r>
+      <w:r>
+        <w:rPr/>
+        <w:t>: Kotlin (</w:t>
+      </w:r>
+      <w:r>
+        <w:rPr/>
+        <w:t>Advanced</w:t>
+      </w:r>
+      <w:r>
+        <w:rPr/>
+        <w:t>), Java (</w:t>
+      </w:r>
+      <w:r>
+        <w:rPr/>
+        <w:t>Advanced</w:t>
+      </w:r>
+      <w:r>
+        <w:rPr/>
+        <w:t xml:space="preserve">), Swift, C++, Android SDK, Jetpack Compose, Coroutines/Flow, Room, Hilt/Dagger, Retrofit, Gradle </w:t>
+      </w:r>
+    </w:p>
+    <w:p>
+      <w:pPr>
+        <w:pStyle w:val="Normal"/>
+      </w:pPr>
+      <w:r>
+        <w:rPr>
+          <w:b w:val="1"/>
+          <w:bCs w:val="1"/>
+        </w:rPr>
+        <w:t>Architecture</w:t>
+      </w:r>
+      <w:r>
+        <w:rPr/>
+        <w:t xml:space="preserve">: Clean Architecture, SOLID, System design, TDD, MVVM/MVI/MVP, multi-module projects </w:t>
+      </w:r>
+    </w:p>
+    <w:p>
+      <w:pPr>
+        <w:pStyle w:val="Normal"/>
+      </w:pPr>
+      <w:r>
+        <w:rPr>
+          <w:b w:val="1"/>
+          <w:bCs w:val="1"/>
+        </w:rPr>
+        <w:t>Testing &amp; Automation</w:t>
+      </w:r>
+      <w:r>
+        <w:rPr/>
+        <w:t>: Unit &amp; UI testing (JUnit, Mockito, Espresso, Kaspresso), CI/CD (Jenkins, TeamCity), performance &amp; memory profiling</w:t>
+      </w:r>
+    </w:p>
+    <w:p>
+      <w:pPr>
+        <w:pStyle w:val="Normal"/>
+      </w:pPr>
+      <w:r>
+        <w:rPr>
+          <w:b w:val="1"/>
+          <w:bCs w:val="1"/>
+        </w:rPr>
+        <w:t>AI</w:t>
+      </w:r>
+      <w:r>
+        <w:rPr/>
+        <w:t>: Cursor, Claude, Gemini, multi-agent workflows, cost optimization, rules,</w:t>
+      </w:r>
+      <w:r>
+        <w:rPr/>
+        <w:t xml:space="preserve"> skills, agents,</w:t>
+      </w:r>
+      <w:r>
+        <w:rPr/>
+        <w:t xml:space="preserve"> </w:t>
+      </w:r>
+      <w:r>
+        <w:rPr/>
+        <w:t>MCP</w:t>
+      </w:r>
+    </w:p>
+    <w:p>
+      <w:pPr>
+        <w:pStyle w:val="Normal"/>
+      </w:pPr>
+      <w:r>
+        <w:rPr>
+          <w:b w:val="1"/>
+          <w:bCs w:val="1"/>
+        </w:rPr>
+        <w:t>Publishing &amp; Analytics</w:t>
+      </w:r>
+      <w:r>
+        <w:rPr/>
+        <w:t>: Play Store publishing (from scratch), release pipeline, A/B experiments, product metrics, crash-free rate, ANR monitoring</w:t>
+      </w:r>
+    </w:p>
+    <w:p>
+      <w:pPr>
+        <w:pStyle w:val="Normal"/>
+      </w:pPr>
+      <w:r>
+        <w:rPr>
+          <w:b w:val="1"/>
+          <w:bCs w:val="1"/>
+        </w:rPr>
+        <w:t>Leadership</w:t>
+      </w:r>
+      <w:r>
+        <w:rPr/>
+        <w:t xml:space="preserve">: </w:t>
+      </w:r>
+      <w:r>
+        <w:rPr/>
+        <w:t>t</w:t>
+      </w:r>
+      <w:r>
+        <w:rPr/>
+        <w:t>eam leadership, mentoring, product ownership, hiring, conflict resolution, public speaking</w:t>
+      </w:r>
+    </w:p>
+    <w:p>
+      <w:pPr>
+        <w:pStyle w:val="Normal"/>
+      </w:pPr>
+      <w:r>
+        <w:rPr>
+          <w:b w:val="1"/>
+          <w:bCs w:val="1"/>
+        </w:rPr>
+        <w:t>Languages</w:t>
+      </w:r>
+      <w:r>
+        <w:rPr/>
+        <w:t>: English (C1), Russian (Native)</w:t>
+      </w:r>
+      <w:r>
+        <w:rPr/>
+        <w:t xml:space="preserve">, </w:t>
+      </w:r>
+      <w:r>
+        <w:rPr/>
+        <w:t>Portuguese (A1)</w:t>
+      </w:r>
+    </w:p>
+    <w:p>
+      <w:pPr>
+        <w:pStyle w:val="Normal"/>
+      </w:pPr>
+    </w:p>
+    <w:p xmlns:wp14="http://schemas.microsoft.com/office/word/2010/wordml" wp14:textId="77777777">
+      <w:pPr>
+        <w:pStyle w:val="Heading1"/>
+        <w:rPr>
+          <w:rFonts w:ascii="Tahoma" w:hAnsi="Tahoma" w:eastAsia="Tahoma" w:cs="Tahoma"/>
+          <w:noProof w:val="0"/>
+          <w:lang w:val="en-US"/>
+        </w:rPr>
+      </w:pPr>
+      <w:r>
+        <w:rPr>
+          <w:rFonts w:ascii="Tahoma" w:hAnsi="Tahoma" w:eastAsia="Tahoma" w:cs="Tahoma"/>
           <w:noProof w:val="0"/>
           <w:lang w:val="en-US"/>
         </w:rPr>
@@ -1516,7 +1769,7 @@
       <w:headerReference w:type="default" r:id="rId10"/>
       <w:footerReference w:type="first" r:id="rId11"/>
       <w:pgSz w:w="12240" w:h="15840" w:orient="portrait" w:code="1"/>
-      <w:pgMar w:top="1440" w:right="1440" w:bottom="1440" w:left="1440" w:header="144" w:footer="0" w:gutter="0"/>
+      <w:pgMar w:top="1440" w:right="1080" w:bottom="1440" w:left="1080" w:header="144" w:footer="0" w:gutter="0"/>
       <w:cols w:space="720"/>
       <w:docGrid w:linePitch="360"/>
     </w:sectPr>

</xml_diff>